<commit_message>
feat: Update PDF generation process
</commit_message>
<xml_diff>
--- a/public/assets/template-form-2.docx
+++ b/public/assets/template-form-2.docx
@@ -28,16 +28,7 @@
         <w:t xml:space="preserve"> </w:t>
       </w:r>
       <w:r>
-        <w:t>01</w:t>
-      </w:r>
-      <w:r>
-        <w:t>/EXT-M/PPAIP-</w:t>
-      </w:r>
-      <w:r>
-        <w:rPr>
-          <w:spacing w:val="-2"/>
-        </w:rPr>
-        <w:t>UB/IV/2026</w:t>
+        <w:t>&lt;&lt;Nomor Surat&gt;&gt;</w:t>
       </w:r>
     </w:p>
     <w:p>

</xml_diff>